<commit_message>
This release adds the complete quantum-measurement arc (QB-007 through QB-010): a machine-verified decomposition of the measurement problem, run under the corpus's standing discipline — bars pre-committed, negatives registered, no tuned parameters.
</commit_message>
<xml_diff>
--- a/papers/_sources/rope_nonlocal_dynamics.docx
+++ b/papers/_sources/rope_nonlocal_dynamics.docx
@@ -3217,6 +3217,313 @@
         <w:t xml:space="preserve"/>
       </w:r>
     </w:p>
+    <w:p>
+      <w:r>
+        <w:rPr>
+          <w:b/>
+        </w:rPr>
+        <w:t>Addendum: The Measurement Problem Decomposed (QB-007, QB-008)</w:t>
+      </w:r>
+    </w:p>
+    <w:p>
+      <w:r>
+        <w:t>The single-detector side of the measurement problem — distinct from the two-party CHSH wall treated above, which is unchanged by everything below — has been decomposed into three labeled parts, two closed and one isolated with quantitative bounds. (i) INDIVISIBILITY, Derived: linking and winding are homotopy invariants; a detection event that creates or flips a knot is all-or-nothing by topology (machine-checked, Hopf pair Lk = −1), which accounts for whole-unit arrivals and their dim-the-source form (fixed-size events at reduced rate). (ii) BENCHMARKED QUADRATIC DETECTION-RATE SCALING under threshold dynamics (weak-field regime): a nucleation site is a threshold (barrier-escape) system, and simulated Kramers dynamics under weak periodic driving gives a rate enhancement scaling as amplitude^1.7–2.1 against a pre-committed 2.0 ± 0.3 bar — threshold crossing responds to energy, so single-site click rates scale as |ψ|²; twenty thousand one-at-a-time draws rebuild the two-slit fringes at correlation 0.997. The interpretation of this scaling as a BORN MECHANISM is conditional: it follows if the threshold (nucleation-barrier) model is the correct physical description of detection, which is itself part of the conjecture under test, not an established fact. The circularity is declared: the derivational content is the exponent; the fringes are the exponent plus geometry. This parallels known semiclassical detection theory and is claimed as a registered decomposition within the rope framework, not as a novel result about detectors. Benchmark: benchmarks/bell/knot_nucleation_measurement.py.</w:t>
+      </w:r>
+    </w:p>
+    <w:p>
+      <w:r>
+        <w:t>(iii) THE ISOLATED CORE, registered as a negative with the discriminator quantified: anticorrelation. For any classical field driving independent threshold sites, Cauchy–Schwarz pins g²(0) ≥ 1 (coherent drive: exactly 1, machine-checked at 2×10⁶ windows; fluctuating drive: bunched, ≈ 1.96), while the measured single-photon value is ≈ 0.18 (Grangier–Roger–Aspect 1986; modern values ≈ 0). Winner-take-all localization therefore requires the firing site to deplete the wave at spacelike separation. QB-008 corners that requirement: Bell-timing experiments (Salart et al. 2008; Yin et al. 2013) bound any preferred-frame influence at v &gt; 1.38×10⁴ c for frames within ~10⁻³ c of Earth — a class containing the CMB rest frame, the mesh frame's natural identification — which via v_L/c = √(K_L/K_T) demands a strand stretch-to-transverse stiffness ratio of at least 1.9×10⁸; and the Bancal et al. (2012) theorem excludes ALL finite speeds (finite-v influence models enable unobserved macroscopic signaling), forcing the conjecture onto the instantaneous-constraint limb. That limb is the ideal limit of the P-VOL near-inextensibility postulate itself — an ideal string propagates tension changes instantaneously, while transverse dynamics remains luminal and the longitudinal channel dark — a consistency, explicitly not a confirmation. Status: the conjecture remains a Conjecture, now with one precisely specified limb, a quantified mechanical demand, and no middle ground; what would move it is a demonstration that instantaneous constraint propagation quantitatively produces g² ≈ 0, which is nobody's result yet. Benchmark: benchmarks/bell/depletion_speed_bounds.py.</w:t>
+      </w:r>
+    </w:p>
+    <w:p>
+      <w:r>
+        <w:t>POSITIONING (QB-010, closing the arc). The cornered limb is not unexplored territory: it is the territory of de Broglie–Bohm pilot-wave theory (de Broglie 1927; Bohm 1952), a preferred-frame instantaneous-influence account that reproduces all of quantum mechanics in equilibrium, including CHSH = 2√2 — an existence proof that the limb is viable, with priority belonging entirely to Bohm. The remaining gap is machine-localized by the adjacency benchmark: the identical first-arrival race yields S = 1.418 with per-particle budgets in physical space (the honest mesh ontology) and S = 2.833 when the rates are drawn from the entangled state's joint intensities on configuration space (imported, not derived); one structural change crosses the quantum gap, so the open question is precisely whether configuration-space guidance can emerge from physical-space mesh mechanics — a reconstruction problem recognized as open within Bohmian foundations itself (Norsen 2010). The ledger runs both ways: Bohm has entanglement and seven decades of development; the mesh has a derived indivisibility (dBB postulates point particles), an independently motivated preferred foliation with a quantified mechanical demand (K_L/K_T ≥ 1.9×10⁸), and the contamination-structure match of the measured g². With this registration the measurement arc reaches its planned stop: decomposed, bounded, cornered, demonstrated sufficient, and positioned. Benchmark: benchmarks/bell/bohmian_adjacency.py.</w:t>
+      </w:r>
+    </w:p>
+    <w:p>
+      <w:r>
+        <w:rPr>
+          <w:b/>
+        </w:rPr>
+        <w:t>Status Table: The Measurement Programme at a Glance</w:t>
+      </w:r>
+    </w:p>
+    <w:tbl>
+      <w:tblPr>
+        <w:tblW w:type="auto" w:w="0"/>
+        <w:tblLook w:firstColumn="1" w:firstRow="1" w:lastColumn="0" w:lastRow="0" w:noHBand="0" w:noVBand="1" w:val="04A0"/>
+      </w:tblPr>
+      <w:tblGrid>
+        <w:gridCol w:w="3120"/>
+        <w:gridCol w:w="3120"/>
+        <w:gridCol w:w="3120"/>
+      </w:tblGrid>
+      <w:tr>
+        <w:tc>
+          <w:tcPr>
+            <w:tcW w:type="dxa" w:w="3120"/>
+          </w:tcPr>
+          <w:p>
+            <w:r>
+              <w:rPr>
+                <w:b/>
+              </w:rPr>
+              <w:t>Measurement component</w:t>
+            </w:r>
+          </w:p>
+        </w:tc>
+        <w:tc>
+          <w:tcPr>
+            <w:tcW w:type="dxa" w:w="3120"/>
+          </w:tcPr>
+          <w:p>
+            <w:r>
+              <w:rPr>
+                <w:b/>
+              </w:rPr>
+              <w:t>Status</w:t>
+            </w:r>
+          </w:p>
+        </w:tc>
+        <w:tc>
+          <w:tcPr>
+            <w:tcW w:type="dxa" w:w="3120"/>
+          </w:tcPr>
+          <w:p>
+            <w:r>
+              <w:rPr>
+                <w:b/>
+              </w:rPr>
+              <w:t>Evidence</w:t>
+            </w:r>
+          </w:p>
+        </w:tc>
+      </w:tr>
+      <w:tr>
+        <w:tc>
+          <w:tcPr>
+            <w:tcW w:type="dxa" w:w="3120"/>
+          </w:tcPr>
+          <w:p>
+            <w:r>
+              <w:t>Topological indivisibility</w:t>
+            </w:r>
+          </w:p>
+        </w:tc>
+        <w:tc>
+          <w:tcPr>
+            <w:tcW w:type="dxa" w:w="3120"/>
+          </w:tcPr>
+          <w:p>
+            <w:r>
+              <w:t>Derived</w:t>
+            </w:r>
+          </w:p>
+        </w:tc>
+        <w:tc>
+          <w:tcPr>
+            <w:tcW w:type="dxa" w:w="3120"/>
+          </w:tcPr>
+          <w:p>
+            <w:r>
+              <w:t>Homotopy invariance; Hopf Lk = −1 benchmark (QB-007)</w:t>
+            </w:r>
+          </w:p>
+        </w:tc>
+      </w:tr>
+      <w:tr>
+        <w:tc>
+          <w:tcPr>
+            <w:tcW w:type="dxa" w:w="3120"/>
+          </w:tcPr>
+          <w:p>
+            <w:r>
+              <w:t>Threshold rate scaling (∝|ψ|²)</w:t>
+            </w:r>
+          </w:p>
+        </w:tc>
+        <w:tc>
+          <w:tcPr>
+            <w:tcW w:type="dxa" w:w="3120"/>
+          </w:tcPr>
+          <w:p>
+            <w:r>
+              <w:t>Benchmarked</w:t>
+            </w:r>
+          </w:p>
+        </w:tc>
+        <w:tc>
+          <w:tcPr>
+            <w:tcW w:type="dxa" w:w="3120"/>
+          </w:tcPr>
+          <w:p>
+            <w:r>
+              <w:t>Kramers escape simulations, exponent ≈ 2 (weak-field regime; Born interpretation conditional on the threshold model)</w:t>
+            </w:r>
+          </w:p>
+        </w:tc>
+      </w:tr>
+      <w:tr>
+        <w:tc>
+          <w:tcPr>
+            <w:tcW w:type="dxa" w:w="3120"/>
+          </w:tcPr>
+          <w:p>
+            <w:r>
+              <w:t>Interference reconstruction</w:t>
+            </w:r>
+          </w:p>
+        </w:tc>
+        <w:tc>
+          <w:tcPr>
+            <w:tcW w:type="dxa" w:w="3120"/>
+          </w:tcPr>
+          <w:p>
+            <w:r>
+              <w:t>Benchmarked</w:t>
+            </w:r>
+          </w:p>
+        </w:tc>
+        <w:tc>
+          <w:tcPr>
+            <w:tcW w:type="dxa" w:w="3120"/>
+          </w:tcPr>
+          <w:p>
+            <w:r>
+              <w:t>20,000-event one-at-a-time simulation, r = 0.997–0.999</w:t>
+            </w:r>
+          </w:p>
+        </w:tc>
+      </w:tr>
+      <w:tr>
+        <w:tc>
+          <w:tcPr>
+            <w:tcW w:type="dxa" w:w="3120"/>
+          </w:tcPr>
+          <w:p>
+            <w:r>
+              <w:t>Per-quantum Born probability P(i) = I_i/ΣI</w:t>
+            </w:r>
+          </w:p>
+        </w:tc>
+        <w:tc>
+          <w:tcPr>
+            <w:tcW w:type="dxa" w:w="3120"/>
+          </w:tcPr>
+          <w:p>
+            <w:r>
+              <w:t>Modeled (exact within the toy)</w:t>
+            </w:r>
+          </w:p>
+        </w:tc>
+        <w:tc>
+          <w:tcPr>
+            <w:tcW w:type="dxa" w:w="3120"/>
+          </w:tcPr>
+          <w:p>
+            <w:r>
+              <w:t>Competing-exponentials identity, verified 6×10⁻⁴ (QB-009)</w:t>
+            </w:r>
+          </w:p>
+        </w:tc>
+      </w:tr>
+      <w:tr>
+        <w:tc>
+          <w:tcPr>
+            <w:tcW w:type="dxa" w:w="3120"/>
+          </w:tcPr>
+          <w:p>
+            <w:r>
+              <w:t>Anticorrelation (single site fires)</w:t>
+            </w:r>
+          </w:p>
+        </w:tc>
+        <w:tc>
+          <w:tcPr>
+            <w:tcW w:type="dxa" w:w="3120"/>
+          </w:tcPr>
+          <w:p>
+            <w:r>
+              <w:t>Negative result / sufficiency split</w:t>
+            </w:r>
+          </w:p>
+        </w:tc>
+        <w:tc>
+          <w:tcPr>
+            <w:tcW w:type="dxa" w:w="3120"/>
+          </w:tcPr>
+          <w:p>
+            <w:r>
+              <w:t>Classical threshold model pinned at g² ≥ 1 vs measured ≈0.18 (QB-007); conservation toy with instantaneous budget gives g² = 0 (QB-009) — sufficiency, not truth</w:t>
+            </w:r>
+          </w:p>
+        </w:tc>
+      </w:tr>
+      <w:tr>
+        <w:tc>
+          <w:tcPr>
+            <w:tcW w:type="dxa" w:w="3120"/>
+          </w:tcPr>
+          <w:p>
+            <w:r>
+              <w:t>Winner-take-all mechanism</w:t>
+            </w:r>
+          </w:p>
+        </w:tc>
+        <w:tc>
+          <w:tcPr>
+            <w:tcW w:type="dxa" w:w="3120"/>
+          </w:tcPr>
+          <w:p>
+            <w:r>
+              <w:t>Conjecture</w:t>
+            </w:r>
+          </w:p>
+        </w:tc>
+        <w:tc>
+          <w:tcPr>
+            <w:tcW w:type="dxa" w:w="3120"/>
+          </w:tcPr>
+          <w:p>
+            <w:r>
+              <w:t>Cornered to the instantaneous-constraint limb; v &gt; 1.38×10⁴ c, K_L/K_T ≥ 1.9×10⁸ (QB-008)</w:t>
+            </w:r>
+          </w:p>
+        </w:tc>
+      </w:tr>
+      <w:tr>
+        <w:tc>
+          <w:tcPr>
+            <w:tcW w:type="dxa" w:w="3120"/>
+          </w:tcPr>
+          <w:p>
+            <w:r>
+              <w:t>CHSH correlation</w:t>
+            </w:r>
+          </w:p>
+        </w:tc>
+        <w:tc>
+          <w:tcPr>
+            <w:tcW w:type="dxa" w:w="3120"/>
+          </w:tcPr>
+          <w:p>
+            <w:r>
+              <w:t>Partial / open</w:t>
+            </w:r>
+          </w:p>
+        </w:tc>
+        <w:tc>
+          <w:tcPr>
+            <w:tcW w:type="dxa" w:w="3120"/>
+          </w:tcPr>
+          <w:p>
+            <w:r>
+              <w:t>Requires the γ = 1 base-sphere coupling identification (§5–§7); adjacency benchmark localizes the gap to configuration-space vs physical-space budgets, S = 1.418 vs 2.833 (QB-010)</w:t>
+            </w:r>
+          </w:p>
+        </w:tc>
+      </w:tr>
+    </w:tbl>
     <w:p>
       <w:pPr>
         <w:pStyle w:val="Heading1"/>

</xml_diff>